<commit_message>
Refine peer review statement tone
</commit_message>
<xml_diff>
--- a/deliverables/exports/peer-review-statement-v2.docx
+++ b/deliverables/exports/peer-review-statement-v2.docx
@@ -17,7 +17,7 @@
         <mc:AlternateContent>
           <mc:Choice Requires="wps">
             <w:drawing>
-              <wp:anchor distT="0" distB="0" distL="114300" distR="114300" simplePos="0" relativeHeight="251659264" behindDoc="1" locked="1" layoutInCell="1" allowOverlap="1" wp14:anchorId="514B7CA8" wp14:editId="7AEC208C">
+              <wp:anchor distT="0" distB="0" distL="114300" distR="114300" simplePos="0" relativeHeight="251659264" behindDoc="1" locked="1" layoutInCell="1" allowOverlap="1" wp14:anchorId="5F2A9815" wp14:editId="3B15A7AD">
                 <wp:simplePos x="0" y="0"/>
                 <wp:positionH relativeFrom="margin">
                   <wp:posOffset>0</wp:posOffset>
@@ -28,7 +28,7 @@
                 <wp:extent cx="6336665" cy="28575"/>
                 <wp:effectExtent l="0" t="0" r="6985" b="9525"/>
                 <wp:wrapNone/>
-                <wp:docPr id="1760235914" name="Rectangle 1"/>
+                <wp:docPr id="1052368034" name="Rectangle 1"/>
                 <wp:cNvGraphicFramePr/>
                 <a:graphic xmlns:a="http://schemas.openxmlformats.org/drawingml/2006/main">
                   <a:graphicData uri="http://schemas.microsoft.com/office/word/2010/wordprocessingShape">
@@ -95,7 +95,7 @@
           </mc:Choice>
           <mc:Fallback>
             <w:pict>
-              <v:rect w14:anchorId="580467E6" id="Rectangle 1" o:spid="_x0000_s1026" style="position:absolute;margin-left:0;margin-top:-29.75pt;width:498.95pt;height:2.25pt;z-index:-251657216;visibility:visible;mso-wrap-style:square;mso-wrap-distance-left:9pt;mso-wrap-distance-top:0;mso-wrap-distance-right:9pt;mso-wrap-distance-bottom:0;mso-position-horizontal:absolute;mso-position-horizontal-relative:margin;mso-position-vertical:absolute;mso-position-vertical-relative:margin;v-text-anchor:middle" o:gfxdata="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" fillcolor="#e63221" stroked="f" strokecolor="#09101d [484]" strokeweight="1pt">
+              <v:rect w14:anchorId="3D50EE47" id="Rectangle 1" o:spid="_x0000_s1026" style="position:absolute;margin-left:0;margin-top:-29.75pt;width:498.95pt;height:2.25pt;z-index:-251657216;visibility:visible;mso-wrap-style:square;mso-wrap-distance-left:9pt;mso-wrap-distance-top:0;mso-wrap-distance-right:9pt;mso-wrap-distance-bottom:0;mso-position-horizontal:absolute;mso-position-horizontal-relative:margin;mso-position-vertical:absolute;mso-position-vertical-relative:margin;v-text-anchor:middle" o:gfxdata="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" fillcolor="#e63221" stroked="f" strokecolor="#09101d [484]" strokeweight="1pt">
                 <w10:wrap anchorx="margin" anchory="margin"/>
                 <w10:anchorlock/>
               </v:rect>
@@ -121,13 +121,13 @@
         <w:rPr>
           <w:noProof/>
         </w:rPr>
-        <w:t>If I had to choose one of the three tested models for a high-stakes deployment scenario, I would choose Model_C because it produced the strongest overall validation performance, including the highest mAP50, recall, and F1 score among the three configurations. In a safety-relevant traffic setting, I would favor that more balanced detection profile over a model that is precise but more likely to miss road users. Even so, I would not consider Model_C ready for direct real-world deployment yet. Before deploymen</w:t>
+        <w:t>Among the three tested configurations, Model_C is the most defensible candidate for a high-stakes deployment scenario because it achieved the strongest overall validation performance, including the highest mAP50, recall, and F1 score. In a safety-relevant traffic context, a more balanced detection profile is preferable to a model that is more precise but more likely to miss road users. However, Model_C should not yet be regarded as ready for direct real-world deployment. Before operational use, the model st</w:t>
       </w:r>
       <w:r>
         <w:rPr>
           <w:noProof/>
         </w:rPr>
-        <w:t>t, I would still require a final held-out test evaluation, stricter validation under realistic traffic conditions, and deeper class-specific error analysis, especially for weaker classes such as Tricycle. In other words, Model_C is the most defensible choice among the three current models, but it still needs further improvement and validation before operational use.</w:t>
+        <w:t>ill requires a final held-out test evaluation, stricter validation under realistic traffic conditions, and deeper class-specific error analysis, especially for weaker classes such as Tricycle. Accordingly, Model_C is the strongest choice among the three current models, but further improvement and validation remain necessary before deployment.</w:t>
       </w:r>
     </w:p>
     <w:bookmarkEnd w:id="0"/>
@@ -146,7 +146,7 @@
   <w:abstractNum w:abstractNumId="0" w15:restartNumberingAfterBreak="0">
     <w:nsid w:val="0000A990"/>
     <w:multiLevelType w:val="multilevel"/>
-    <w:tmpl w:val="E2C2D814"/>
+    <w:tmpl w:val="96D4E390"/>
     <w:lvl w:ilvl="0">
       <w:numFmt w:val="bullet"/>
       <w:lvlText w:val=" "/>
@@ -220,7 +220,7 @@
       </w:pPr>
     </w:lvl>
   </w:abstractNum>
-  <w:num w:numId="1" w16cid:durableId="14233071">
+  <w:num w:numId="1" w16cid:durableId="405763469">
     <w:abstractNumId w:val="0"/>
   </w:num>
 </w:numbering>

</xml_diff>